<commit_message>
refactor: implement robust mic initialization and conditional barge-in logic in VoiceHandler
</commit_message>
<xml_diff>
--- a/Context and workflow.docx
+++ b/Context and workflow.docx
@@ -14,43 +14,53 @@
           <w:b/>
           <w:bCs/>
         </w:rPr>
-        <w:t>Project Overview: 'telex', The AI Companion</w:t>
-      </w:r>
-    </w:p>
-    <w:p>
-      <w:r>
-        <w:t>'telex' is a fully custom, voice-interactive AI companion that runs entirely on a local machine. Think of it not as a simple chatbot, but as a complete digital entity with a distinct personality, a voice, and the ability to remember past conversations. It's designed to be a witty and engaging friend, providing both entertaining banter and helpful, context-aware responses.</w:t>
-      </w:r>
-    </w:p>
-    <w:p>
-      <w:r>
-        <w:pict w14:anchorId="15D501C4">
-          <v:rect id="_x0000_i1055" style="width:0;height:1.5pt" o:hralign="center" o:hrstd="t" o:hr="t" fillcolor="#a0a0a0" stroked="f"/>
-        </w:pict>
-      </w:r>
-    </w:p>
-    <w:p>
-      <w:pPr>
-        <w:rPr>
-          <w:b/>
-          <w:bCs/>
-        </w:rPr>
-      </w:pPr>
-      <w:r>
-        <w:rPr>
-          <w:b/>
-          <w:bCs/>
-        </w:rPr>
-        <w:t>Core Components &amp; Technology</w:t>
-      </w:r>
-    </w:p>
-    <w:p>
-      <w:pPr>
-        <w:rPr>
-          <w:b/>
-          <w:bCs/>
-        </w:rPr>
-      </w:pPr>
+        <w:t># Project Overview: 'telex', The AI Companion</w:t>
+      </w:r>
+    </w:p>
+    <w:p>
+      <w:pPr>
+        <w:rPr>
+          <w:b/>
+          <w:bCs/>
+        </w:rPr>
+      </w:pPr>
+      <w:r>
+        <w:rPr>
+          <w:b/>
+          <w:bCs/>
+        </w:rPr>
+        <w:t>'telex' is a fully custom, voice-interactive AI companion that runs entirely on a local machine. It moves beyond simple chatbots to become a complete digital entity with a distinct personality, a voice, and a persistent memory. It features a modern, animated interface and uses advanced local AI models to provide witty, context-aware interactions.</w:t>
+      </w:r>
+    </w:p>
+    <w:p>
+      <w:pPr>
+        <w:rPr>
+          <w:b/>
+          <w:bCs/>
+        </w:rPr>
+      </w:pPr>
+      <w:r>
+        <w:rPr>
+          <w:b/>
+          <w:bCs/>
+        </w:rPr>
+        <w:t>## Core Components &amp; Technology</w:t>
+      </w:r>
+    </w:p>
+    <w:p>
+      <w:pPr>
+        <w:rPr>
+          <w:b/>
+          <w:bCs/>
+        </w:rPr>
+      </w:pPr>
+      <w:r>
+        <w:rPr>
+          <w:b/>
+          <w:bCs/>
+        </w:rPr>
+        <w:t xml:space="preserve">### </w:t>
+      </w:r>
       <w:r>
         <w:rPr>
           <w:rFonts w:ascii="Segoe UI Emoji" w:hAnsi="Segoe UI Emoji" w:cs="Segoe UI Emoji"/>
@@ -69,113 +79,229 @@
     </w:p>
     <w:p>
       <w:pPr>
-        <w:numPr>
-          <w:ilvl w:val="0"/>
-          <w:numId w:val="1"/>
-        </w:numPr>
-      </w:pPr>
-      <w:r>
-        <w:rPr>
-          <w:b/>
-          <w:bCs/>
-        </w:rPr>
-        <w:t>What It Is (In Simple Terms):</w:t>
-      </w:r>
-      <w:r>
-        <w:t xml:space="preserve"> This is the part that does the actual thinking. It's powered by a large language model, which is like a highly advanced autocomplete trained on a massive amount of text. We've given this brain a custom "personality chip" (config.py) that instructs it to act as 'telex'—a sarcastic, witty friend who never breaks character.</w:t>
-      </w:r>
-    </w:p>
-    <w:p>
-      <w:pPr>
-        <w:numPr>
-          <w:ilvl w:val="0"/>
-          <w:numId w:val="1"/>
-        </w:numPr>
-      </w:pPr>
-      <w:r>
-        <w:rPr>
-          <w:b/>
-          <w:bCs/>
-        </w:rPr>
-        <w:t>Tech Stack:</w:t>
-      </w:r>
-    </w:p>
-    <w:p>
-      <w:pPr>
-        <w:numPr>
-          <w:ilvl w:val="1"/>
-          <w:numId w:val="1"/>
-        </w:numPr>
-      </w:pPr>
-      <w:r>
-        <w:rPr>
-          <w:b/>
-          <w:bCs/>
-        </w:rPr>
-        <w:t>Language:</w:t>
-      </w:r>
-      <w:r>
-        <w:t xml:space="preserve"> Python</w:t>
-      </w:r>
-    </w:p>
-    <w:p>
-      <w:pPr>
-        <w:numPr>
-          <w:ilvl w:val="1"/>
-          <w:numId w:val="1"/>
-        </w:numPr>
-      </w:pPr>
-      <w:r>
-        <w:rPr>
-          <w:b/>
-          <w:bCs/>
-        </w:rPr>
-        <w:t>Core Model:</w:t>
-      </w:r>
-      <w:r>
-        <w:t xml:space="preserve"> Meta-Llama-3.1-8B-Instruct (GGUF format)</w:t>
-      </w:r>
-    </w:p>
-    <w:p>
-      <w:pPr>
-        <w:numPr>
-          <w:ilvl w:val="1"/>
-          <w:numId w:val="1"/>
-        </w:numPr>
-      </w:pPr>
-      <w:r>
-        <w:rPr>
-          <w:b/>
-          <w:bCs/>
-        </w:rPr>
-        <w:t>Model Loader:</w:t>
-      </w:r>
-      <w:r>
-        <w:t xml:space="preserve"> llama-</w:t>
+        <w:rPr>
+          <w:b/>
+          <w:bCs/>
+        </w:rPr>
+      </w:pPr>
+      <w:r>
+        <w:rPr>
+          <w:b/>
+          <w:bCs/>
+        </w:rPr>
+        <w:t xml:space="preserve">*   **What It </w:t>
+      </w:r>
+      <w:proofErr w:type="gramStart"/>
+      <w:r>
+        <w:rPr>
+          <w:b/>
+          <w:bCs/>
+        </w:rPr>
+        <w:t>Is:*</w:t>
+      </w:r>
+      <w:proofErr w:type="gramEnd"/>
+      <w:r>
+        <w:rPr>
+          <w:b/>
+          <w:bCs/>
+        </w:rPr>
+        <w:t xml:space="preserve">* The cognitive </w:t>
       </w:r>
       <w:proofErr w:type="spellStart"/>
       <w:r>
+        <w:rPr>
+          <w:b/>
+          <w:bCs/>
+        </w:rPr>
+        <w:t>center</w:t>
+      </w:r>
+      <w:proofErr w:type="spellEnd"/>
+      <w:r>
+        <w:rPr>
+          <w:b/>
+          <w:bCs/>
+        </w:rPr>
+        <w:t xml:space="preserve"> powered by a large language model. It uses a custom "personality chip" ([</w:t>
+      </w:r>
+      <w:proofErr w:type="gramStart"/>
+      <w:r>
+        <w:rPr>
+          <w:b/>
+          <w:bCs/>
+        </w:rPr>
+        <w:t>config.py](</w:t>
+      </w:r>
+      <w:proofErr w:type="gramEnd"/>
+      <w:r>
+        <w:rPr>
+          <w:b/>
+          <w:bCs/>
+          <w:u w:val="single"/>
+        </w:rPr>
+        <w:t>cci:7://file:///e:/Projects/@Personal_project/pc_assistant/AI-Assistant-/config.py:0:0-0:0</w:t>
+      </w:r>
+      <w:r>
+        <w:rPr>
+          <w:b/>
+          <w:bCs/>
+        </w:rPr>
+        <w:t>)) to maintain 'telex's' persona—sarcastic, witty, and helpful.</w:t>
+      </w:r>
+    </w:p>
+    <w:p>
+      <w:pPr>
+        <w:rPr>
+          <w:b/>
+          <w:bCs/>
+        </w:rPr>
+      </w:pPr>
+      <w:r>
+        <w:rPr>
+          <w:b/>
+          <w:bCs/>
+        </w:rPr>
+        <w:t xml:space="preserve">*   **Tech </w:t>
+      </w:r>
+      <w:proofErr w:type="gramStart"/>
+      <w:r>
+        <w:rPr>
+          <w:b/>
+          <w:bCs/>
+        </w:rPr>
+        <w:t>Stack:*</w:t>
+      </w:r>
+      <w:proofErr w:type="gramEnd"/>
+      <w:r>
+        <w:rPr>
+          <w:b/>
+          <w:bCs/>
+        </w:rPr>
+        <w:t>*</w:t>
+      </w:r>
+    </w:p>
+    <w:p>
+      <w:pPr>
+        <w:rPr>
+          <w:b/>
+          <w:bCs/>
+        </w:rPr>
+      </w:pPr>
+      <w:r>
+        <w:rPr>
+          <w:b/>
+          <w:bCs/>
+        </w:rPr>
+        <w:t xml:space="preserve">    *   **</w:t>
+      </w:r>
+      <w:proofErr w:type="gramStart"/>
+      <w:r>
+        <w:rPr>
+          <w:b/>
+          <w:bCs/>
+        </w:rPr>
+        <w:t>Language:*</w:t>
+      </w:r>
+      <w:proofErr w:type="gramEnd"/>
+      <w:r>
+        <w:rPr>
+          <w:b/>
+          <w:bCs/>
+        </w:rPr>
+        <w:t>* Python</w:t>
+      </w:r>
+    </w:p>
+    <w:p>
+      <w:pPr>
+        <w:rPr>
+          <w:b/>
+          <w:bCs/>
+        </w:rPr>
+      </w:pPr>
+      <w:r>
+        <w:rPr>
+          <w:b/>
+          <w:bCs/>
+        </w:rPr>
+        <w:t xml:space="preserve">    *   **Core </w:t>
+      </w:r>
+      <w:proofErr w:type="gramStart"/>
+      <w:r>
+        <w:rPr>
+          <w:b/>
+          <w:bCs/>
+        </w:rPr>
+        <w:t>Model:*</w:t>
+      </w:r>
+      <w:proofErr w:type="gramEnd"/>
+      <w:r>
+        <w:rPr>
+          <w:b/>
+          <w:bCs/>
+        </w:rPr>
+        <w:t>* Meta-Llama-3.1-8B-Instruct (GGUF format)</w:t>
+      </w:r>
+    </w:p>
+    <w:p>
+      <w:pPr>
+        <w:rPr>
+          <w:b/>
+          <w:bCs/>
+        </w:rPr>
+      </w:pPr>
+      <w:r>
+        <w:rPr>
+          <w:b/>
+          <w:bCs/>
+        </w:rPr>
+        <w:t xml:space="preserve">    *   **Model </w:t>
+      </w:r>
+      <w:proofErr w:type="gramStart"/>
+      <w:r>
+        <w:rPr>
+          <w:b/>
+          <w:bCs/>
+        </w:rPr>
+        <w:t>Loader:*</w:t>
+      </w:r>
+      <w:proofErr w:type="gramEnd"/>
+      <w:r>
+        <w:rPr>
+          <w:b/>
+          <w:bCs/>
+        </w:rPr>
+        <w:t>* `llama-</w:t>
+      </w:r>
+      <w:proofErr w:type="spellStart"/>
+      <w:r>
+        <w:rPr>
+          <w:b/>
+          <w:bCs/>
+        </w:rPr>
         <w:t>cpp</w:t>
       </w:r>
       <w:proofErr w:type="spellEnd"/>
       <w:r>
-        <w:t>-python library to run the model efficiently on local hardware.</w:t>
-      </w:r>
-    </w:p>
-    <w:p>
-      <w:r>
-        <w:pict w14:anchorId="27B188EE">
-          <v:rect id="_x0000_i1056" style="width:0;height:1.5pt" o:hralign="center" o:hrstd="t" o:hr="t" fillcolor="#a0a0a0" stroked="f"/>
-        </w:pict>
-      </w:r>
-    </w:p>
-    <w:p>
-      <w:pPr>
-        <w:rPr>
-          <w:b/>
-          <w:bCs/>
-        </w:rPr>
-      </w:pPr>
+        <w:rPr>
+          <w:b/>
+          <w:bCs/>
+        </w:rPr>
+        <w:t>-python` for efficient local inference without heavy GPU requirements.</w:t>
+      </w:r>
+    </w:p>
+    <w:p>
+      <w:pPr>
+        <w:rPr>
+          <w:b/>
+          <w:bCs/>
+        </w:rPr>
+      </w:pPr>
+      <w:r>
+        <w:rPr>
+          <w:b/>
+          <w:bCs/>
+        </w:rPr>
+        <w:t xml:space="preserve">### </w:t>
+      </w:r>
       <w:r>
         <w:rPr>
           <w:rFonts w:ascii="Segoe UI Emoji" w:hAnsi="Segoe UI Emoji" w:cs="Segoe UI Emoji"/>
@@ -194,101 +320,396 @@
     </w:p>
     <w:p>
       <w:pPr>
-        <w:numPr>
-          <w:ilvl w:val="0"/>
-          <w:numId w:val="2"/>
-        </w:numPr>
-      </w:pPr>
-      <w:r>
-        <w:rPr>
-          <w:b/>
-          <w:bCs/>
-        </w:rPr>
-        <w:t>What It Is (In Simple Terms):</w:t>
-      </w:r>
-      <w:r>
-        <w:t xml:space="preserve"> This is the visual chat window on the screen. It’s where you type your messages and read the AI's replies. It’s the physical bridge between you and the AI's brain, designed to be simple and intuitive.</w:t>
-      </w:r>
-    </w:p>
-    <w:p>
-      <w:pPr>
-        <w:numPr>
-          <w:ilvl w:val="0"/>
-          <w:numId w:val="2"/>
-        </w:numPr>
-      </w:pPr>
-      <w:r>
-        <w:rPr>
-          <w:b/>
-          <w:bCs/>
-        </w:rPr>
-        <w:t>Tech Stack:</w:t>
-      </w:r>
-    </w:p>
-    <w:p>
-      <w:pPr>
-        <w:numPr>
-          <w:ilvl w:val="1"/>
-          <w:numId w:val="2"/>
-        </w:numPr>
-      </w:pPr>
-      <w:r>
-        <w:rPr>
-          <w:b/>
-          <w:bCs/>
-        </w:rPr>
-        <w:t>Language:</w:t>
-      </w:r>
-      <w:r>
-        <w:t xml:space="preserve"> Python</w:t>
-      </w:r>
-    </w:p>
-    <w:p>
-      <w:pPr>
-        <w:numPr>
-          <w:ilvl w:val="1"/>
-          <w:numId w:val="2"/>
-        </w:numPr>
-      </w:pPr>
-      <w:r>
-        <w:rPr>
-          <w:b/>
-          <w:bCs/>
-        </w:rPr>
-        <w:t>GUI Framework:</w:t>
-      </w:r>
-      <w:r>
-        <w:t xml:space="preserve"> </w:t>
+        <w:rPr>
+          <w:b/>
+          <w:bCs/>
+        </w:rPr>
+      </w:pPr>
+      <w:r>
+        <w:rPr>
+          <w:b/>
+          <w:bCs/>
+        </w:rPr>
+        <w:t xml:space="preserve">*   **What It </w:t>
+      </w:r>
+      <w:proofErr w:type="gramStart"/>
+      <w:r>
+        <w:rPr>
+          <w:b/>
+          <w:bCs/>
+        </w:rPr>
+        <w:t>Is:*</w:t>
+      </w:r>
+      <w:proofErr w:type="gramEnd"/>
+      <w:r>
+        <w:rPr>
+          <w:b/>
+          <w:bCs/>
+        </w:rPr>
+        <w:t xml:space="preserve">* A modern, dark-themed visual interface. Unlike standard chat windows, this features a dynamic "Eclipse Portal"—a liquid, animated visualization that changes </w:t>
       </w:r>
       <w:proofErr w:type="spellStart"/>
       <w:r>
+        <w:rPr>
+          <w:b/>
+          <w:bCs/>
+        </w:rPr>
+        <w:t>color</w:t>
+      </w:r>
+      <w:proofErr w:type="spellEnd"/>
+      <w:r>
+        <w:rPr>
+          <w:b/>
+          <w:bCs/>
+        </w:rPr>
+        <w:t xml:space="preserve"> and </w:t>
+      </w:r>
+      <w:proofErr w:type="spellStart"/>
+      <w:r>
+        <w:rPr>
+          <w:b/>
+          <w:bCs/>
+        </w:rPr>
+        <w:t>behavior</w:t>
+      </w:r>
+      <w:proofErr w:type="spellEnd"/>
+      <w:r>
+        <w:rPr>
+          <w:b/>
+          <w:bCs/>
+        </w:rPr>
+        <w:t xml:space="preserve"> based on the AI's state (Listening, Thinking, Speaking).</w:t>
+      </w:r>
+    </w:p>
+    <w:p>
+      <w:pPr>
+        <w:rPr>
+          <w:b/>
+          <w:bCs/>
+        </w:rPr>
+      </w:pPr>
+      <w:r>
+        <w:rPr>
+          <w:b/>
+          <w:bCs/>
+        </w:rPr>
+        <w:t xml:space="preserve">*   **Tech </w:t>
+      </w:r>
+      <w:proofErr w:type="gramStart"/>
+      <w:r>
+        <w:rPr>
+          <w:b/>
+          <w:bCs/>
+        </w:rPr>
+        <w:t>Stack:*</w:t>
+      </w:r>
+      <w:proofErr w:type="gramEnd"/>
+      <w:r>
+        <w:rPr>
+          <w:b/>
+          <w:bCs/>
+        </w:rPr>
+        <w:t>*</w:t>
+      </w:r>
+    </w:p>
+    <w:p>
+      <w:pPr>
+        <w:rPr>
+          <w:b/>
+          <w:bCs/>
+        </w:rPr>
+      </w:pPr>
+      <w:r>
+        <w:rPr>
+          <w:b/>
+          <w:bCs/>
+        </w:rPr>
+        <w:t xml:space="preserve">    *   **</w:t>
+      </w:r>
+      <w:proofErr w:type="gramStart"/>
+      <w:r>
+        <w:rPr>
+          <w:b/>
+          <w:bCs/>
+        </w:rPr>
+        <w:t>Framework:*</w:t>
+      </w:r>
+      <w:proofErr w:type="gramEnd"/>
+      <w:r>
+        <w:rPr>
+          <w:b/>
+          <w:bCs/>
+        </w:rPr>
+        <w:t>* `</w:t>
+      </w:r>
+      <w:proofErr w:type="spellStart"/>
+      <w:r>
+        <w:rPr>
+          <w:b/>
+          <w:bCs/>
+        </w:rPr>
+        <w:t>CustomTkinter</w:t>
+      </w:r>
+      <w:proofErr w:type="spellEnd"/>
+      <w:r>
+        <w:rPr>
+          <w:b/>
+          <w:bCs/>
+        </w:rPr>
+        <w:t xml:space="preserve">` (Modern, dark-mode focused wrapper around </w:t>
+      </w:r>
+      <w:proofErr w:type="spellStart"/>
+      <w:r>
+        <w:rPr>
+          <w:b/>
+          <w:bCs/>
+        </w:rPr>
         <w:t>Tkinter</w:t>
       </w:r>
       <w:proofErr w:type="spellEnd"/>
       <w:r>
-        <w:t xml:space="preserve"> (Python's standard library for creating desktop applications).</w:t>
-      </w:r>
-    </w:p>
-    <w:p>
-      <w:r>
-        <w:pict w14:anchorId="60DEEC4C">
-          <v:rect id="_x0000_i1057" style="width:0;height:1.5pt" o:hralign="center" o:hrstd="t" o:hr="t" fillcolor="#a0a0a0" stroked="f"/>
-        </w:pict>
-      </w:r>
-    </w:p>
-    <w:p>
-      <w:pPr>
-        <w:rPr>
-          <w:b/>
-          <w:bCs/>
-        </w:rPr>
-      </w:pPr>
+        <w:rPr>
+          <w:b/>
+          <w:bCs/>
+        </w:rPr>
+        <w:t>).</w:t>
+      </w:r>
+    </w:p>
+    <w:p>
+      <w:pPr>
+        <w:rPr>
+          <w:b/>
+          <w:bCs/>
+        </w:rPr>
+      </w:pPr>
+      <w:r>
+        <w:rPr>
+          <w:b/>
+          <w:bCs/>
+        </w:rPr>
+        <w:t xml:space="preserve">    *   **</w:t>
+      </w:r>
+      <w:proofErr w:type="gramStart"/>
+      <w:r>
+        <w:rPr>
+          <w:b/>
+          <w:bCs/>
+        </w:rPr>
+        <w:t>Visuals:*</w:t>
+      </w:r>
+      <w:proofErr w:type="gramEnd"/>
+      <w:r>
+        <w:rPr>
+          <w:b/>
+          <w:bCs/>
+        </w:rPr>
+        <w:t>* Custom [EclipseRing](</w:t>
+      </w:r>
+      <w:r>
+        <w:rPr>
+          <w:b/>
+          <w:bCs/>
+          <w:u w:val="single"/>
+        </w:rPr>
+        <w:t>cci:2://file:///e:/Projects/@Personal_project/pc_assistant/AI-Assistant-/ui_handler.py:12:0-104:70</w:t>
+      </w:r>
+      <w:r>
+        <w:rPr>
+          <w:b/>
+          <w:bCs/>
+        </w:rPr>
+        <w:t>) class for procedural animations (responsive to voice and state).</w:t>
+      </w:r>
+    </w:p>
+    <w:p>
+      <w:pPr>
+        <w:rPr>
+          <w:b/>
+          <w:bCs/>
+        </w:rPr>
+      </w:pPr>
+      <w:r>
+        <w:rPr>
+          <w:b/>
+          <w:bCs/>
+        </w:rPr>
+        <w:t xml:space="preserve">    *   **</w:t>
+      </w:r>
+      <w:proofErr w:type="gramStart"/>
+      <w:r>
+        <w:rPr>
+          <w:b/>
+          <w:bCs/>
+        </w:rPr>
+        <w:t>States:*</w:t>
+      </w:r>
+      <w:proofErr w:type="gramEnd"/>
+      <w:r>
+        <w:rPr>
+          <w:b/>
+          <w:bCs/>
+        </w:rPr>
+        <w:t>*</w:t>
+      </w:r>
+    </w:p>
+    <w:p>
+      <w:pPr>
+        <w:rPr>
+          <w:b/>
+          <w:bCs/>
+        </w:rPr>
+      </w:pPr>
+      <w:r>
+        <w:rPr>
+          <w:b/>
+          <w:bCs/>
+        </w:rPr>
+        <w:t xml:space="preserve">        *   </w:t>
+      </w:r>
       <w:r>
         <w:rPr>
           <w:rFonts w:ascii="Segoe UI Emoji" w:hAnsi="Segoe UI Emoji" w:cs="Segoe UI Emoji"/>
           <w:b/>
           <w:bCs/>
         </w:rPr>
+        <w:t>🟣</w:t>
+      </w:r>
+      <w:r>
+        <w:rPr>
+          <w:b/>
+          <w:bCs/>
+        </w:rPr>
+        <w:t xml:space="preserve"> **</w:t>
+      </w:r>
+      <w:proofErr w:type="gramStart"/>
+      <w:r>
+        <w:rPr>
+          <w:b/>
+          <w:bCs/>
+        </w:rPr>
+        <w:t>Listening:*</w:t>
+      </w:r>
+      <w:proofErr w:type="gramEnd"/>
+      <w:r>
+        <w:rPr>
+          <w:b/>
+          <w:bCs/>
+        </w:rPr>
+        <w:t>* Stable, breathing Pulse (Purple/Lavender).</w:t>
+      </w:r>
+    </w:p>
+    <w:p>
+      <w:pPr>
+        <w:rPr>
+          <w:b/>
+          <w:bCs/>
+        </w:rPr>
+      </w:pPr>
+      <w:r>
+        <w:rPr>
+          <w:b/>
+          <w:bCs/>
+        </w:rPr>
+        <w:t xml:space="preserve">        *   </w:t>
+      </w:r>
+      <w:r>
+        <w:rPr>
+          <w:rFonts w:ascii="Segoe UI Emoji" w:hAnsi="Segoe UI Emoji" w:cs="Segoe UI Emoji"/>
+          <w:b/>
+          <w:bCs/>
+        </w:rPr>
+        <w:t>🔵</w:t>
+      </w:r>
+      <w:r>
+        <w:rPr>
+          <w:b/>
+          <w:bCs/>
+        </w:rPr>
+        <w:t xml:space="preserve"> **</w:t>
+      </w:r>
+      <w:proofErr w:type="gramStart"/>
+      <w:r>
+        <w:rPr>
+          <w:b/>
+          <w:bCs/>
+        </w:rPr>
+        <w:t>Thinking:*</w:t>
+      </w:r>
+      <w:proofErr w:type="gramEnd"/>
+      <w:r>
+        <w:rPr>
+          <w:b/>
+          <w:bCs/>
+        </w:rPr>
+        <w:t>* Fast, vortex-like Spin (Cyan/Blue).</w:t>
+      </w:r>
+    </w:p>
+    <w:p>
+      <w:pPr>
+        <w:rPr>
+          <w:b/>
+          <w:bCs/>
+        </w:rPr>
+      </w:pPr>
+      <w:r>
+        <w:rPr>
+          <w:b/>
+          <w:bCs/>
+        </w:rPr>
+        <w:t xml:space="preserve">        *   </w:t>
+      </w:r>
+      <w:r>
+        <w:rPr>
+          <w:rFonts w:ascii="Segoe UI Emoji" w:hAnsi="Segoe UI Emoji" w:cs="Segoe UI Emoji"/>
+          <w:b/>
+          <w:bCs/>
+        </w:rPr>
+        <w:t>🔴</w:t>
+      </w:r>
+      <w:r>
+        <w:rPr>
+          <w:b/>
+          <w:bCs/>
+        </w:rPr>
+        <w:t xml:space="preserve"> **</w:t>
+      </w:r>
+      <w:proofErr w:type="gramStart"/>
+      <w:r>
+        <w:rPr>
+          <w:b/>
+          <w:bCs/>
+        </w:rPr>
+        <w:t>Speaking:*</w:t>
+      </w:r>
+      <w:proofErr w:type="gramEnd"/>
+      <w:r>
+        <w:rPr>
+          <w:b/>
+          <w:bCs/>
+        </w:rPr>
+        <w:t>* Energetic Pulse &amp; Tilt (Pink/Magenta).</w:t>
+      </w:r>
+    </w:p>
+    <w:p>
+      <w:pPr>
+        <w:rPr>
+          <w:b/>
+          <w:bCs/>
+        </w:rPr>
+      </w:pPr>
+      <w:r>
+        <w:rPr>
+          <w:b/>
+          <w:bCs/>
+        </w:rPr>
+        <w:t xml:space="preserve">### </w:t>
+      </w:r>
+      <w:r>
+        <w:rPr>
+          <w:rFonts w:ascii="Segoe UI Emoji" w:hAnsi="Segoe UI Emoji" w:cs="Segoe UI Emoji"/>
+          <w:b/>
+          <w:bCs/>
+        </w:rPr>
         <w:t>🎤</w:t>
       </w:r>
       <w:r>
@@ -316,85 +737,72 @@
     </w:p>
     <w:p>
       <w:pPr>
-        <w:numPr>
-          <w:ilvl w:val="0"/>
-          <w:numId w:val="3"/>
-        </w:numPr>
-      </w:pPr>
-      <w:r>
-        <w:rPr>
-          <w:b/>
-          <w:bCs/>
-        </w:rPr>
-        <w:t>What It Is (In Simple Terms):</w:t>
-      </w:r>
-      <w:r>
-        <w:t xml:space="preserve"> This gives 'telex' its voice.</w:t>
-      </w:r>
-    </w:p>
-    <w:p>
-      <w:pPr>
-        <w:numPr>
-          <w:ilvl w:val="1"/>
-          <w:numId w:val="3"/>
-        </w:numPr>
-      </w:pPr>
-      <w:r>
-        <w:t xml:space="preserve">The </w:t>
-      </w:r>
-      <w:r>
-        <w:rPr>
-          <w:b/>
-          <w:bCs/>
-        </w:rPr>
-        <w:t>"Ears"</w:t>
-      </w:r>
-      <w:r>
-        <w:t xml:space="preserve"> listen to you through the microphone and use an advanced transcription model to convert your spoken words into text the AI can understand.</w:t>
-      </w:r>
-    </w:p>
-    <w:p>
-      <w:pPr>
-        <w:numPr>
-          <w:ilvl w:val="1"/>
-          <w:numId w:val="3"/>
-        </w:numPr>
-      </w:pPr>
-      <w:r>
-        <w:t xml:space="preserve">The </w:t>
-      </w:r>
-      <w:r>
-        <w:rPr>
-          <w:b/>
-          <w:bCs/>
-        </w:rPr>
-        <w:t>"Mouth"</w:t>
-      </w:r>
-      <w:r>
-        <w:t xml:space="preserve"> takes the AI's text replies and converts them into natural-sounding speech, so it can talk back to you.</w:t>
-      </w:r>
-    </w:p>
-    <w:p>
-      <w:pPr>
-        <w:numPr>
-          <w:ilvl w:val="0"/>
-          <w:numId w:val="3"/>
-        </w:numPr>
-      </w:pPr>
-      <w:r>
-        <w:rPr>
-          <w:b/>
-          <w:bCs/>
-        </w:rPr>
-        <w:t>Tech Stack:</w:t>
-      </w:r>
-    </w:p>
-    <w:p>
-      <w:pPr>
-        <w:numPr>
-          <w:ilvl w:val="1"/>
-          <w:numId w:val="3"/>
-        </w:numPr>
+        <w:rPr>
+          <w:b/>
+          <w:bCs/>
+        </w:rPr>
+      </w:pPr>
+      <w:r>
+        <w:rPr>
+          <w:b/>
+          <w:bCs/>
+        </w:rPr>
+        <w:t xml:space="preserve">*   **What It </w:t>
+      </w:r>
+      <w:proofErr w:type="gramStart"/>
+      <w:r>
+        <w:rPr>
+          <w:b/>
+          <w:bCs/>
+        </w:rPr>
+        <w:t>Is:*</w:t>
+      </w:r>
+      <w:proofErr w:type="gramEnd"/>
+      <w:r>
+        <w:rPr>
+          <w:b/>
+          <w:bCs/>
+        </w:rPr>
+        <w:t>* A full-duplex voice system allowing for natural conversation. It supports "Barge-in," meaning you can interrupt the AI while it's speaking, and it will stop to listen—just like a real person.</w:t>
+      </w:r>
+    </w:p>
+    <w:p>
+      <w:pPr>
+        <w:rPr>
+          <w:b/>
+          <w:bCs/>
+        </w:rPr>
+      </w:pPr>
+      <w:r>
+        <w:rPr>
+          <w:b/>
+          <w:bCs/>
+        </w:rPr>
+        <w:t xml:space="preserve">*   **Tech </w:t>
+      </w:r>
+      <w:proofErr w:type="gramStart"/>
+      <w:r>
+        <w:rPr>
+          <w:b/>
+          <w:bCs/>
+        </w:rPr>
+        <w:t>Stack:*</w:t>
+      </w:r>
+      <w:proofErr w:type="gramEnd"/>
+      <w:r>
+        <w:rPr>
+          <w:b/>
+          <w:bCs/>
+        </w:rPr>
+        <w:t>*</w:t>
+      </w:r>
+    </w:p>
+    <w:p>
+      <w:pPr>
+        <w:rPr>
+          <w:b/>
+          <w:bCs/>
+        </w:rPr>
       </w:pPr>
       <w:r>
         <w:rPr>
@@ -402,78 +810,258 @@
           <w:bCs/>
         </w:rPr>
         <w:lastRenderedPageBreak/>
-        <w:t>Speech-to-Text (Ears):</w:t>
-      </w:r>
-      <w:r>
-        <w:t xml:space="preserve"> faster-whisper library for high-accuracy, offline transcription.</w:t>
-      </w:r>
-    </w:p>
-    <w:p>
-      <w:pPr>
-        <w:numPr>
-          <w:ilvl w:val="1"/>
-          <w:numId w:val="3"/>
-        </w:numPr>
-      </w:pPr>
-      <w:r>
-        <w:rPr>
-          <w:b/>
-          <w:bCs/>
-        </w:rPr>
-        <w:t>Text-to-Speech (Mouth):</w:t>
-      </w:r>
-      <w:r>
-        <w:t xml:space="preserve"> Coqui TTS engine for generating human-like speech locally.</w:t>
-      </w:r>
-    </w:p>
-    <w:p>
-      <w:pPr>
-        <w:numPr>
-          <w:ilvl w:val="1"/>
-          <w:numId w:val="3"/>
-        </w:numPr>
-      </w:pPr>
-      <w:r>
-        <w:rPr>
-          <w:b/>
-          <w:bCs/>
-        </w:rPr>
-        <w:t>Audio Handling:</w:t>
-      </w:r>
-      <w:r>
-        <w:t xml:space="preserve"> </w:t>
+        <w:t xml:space="preserve">    *   **Ears (Speech-to-Text</w:t>
+      </w:r>
+      <w:proofErr w:type="gramStart"/>
+      <w:r>
+        <w:rPr>
+          <w:b/>
+          <w:bCs/>
+        </w:rPr>
+        <w:t>):*</w:t>
+      </w:r>
+      <w:proofErr w:type="gramEnd"/>
+      <w:r>
+        <w:rPr>
+          <w:b/>
+          <w:bCs/>
+        </w:rPr>
+        <w:t>* `faster-whisper` for high-speed, offline transcription.</w:t>
+      </w:r>
+    </w:p>
+    <w:p>
+      <w:pPr>
+        <w:rPr>
+          <w:b/>
+          <w:bCs/>
+        </w:rPr>
+      </w:pPr>
+      <w:r>
+        <w:rPr>
+          <w:b/>
+          <w:bCs/>
+        </w:rPr>
+        <w:t xml:space="preserve">    *   **Mouth (Text-to-Speech</w:t>
+      </w:r>
+      <w:proofErr w:type="gramStart"/>
+      <w:r>
+        <w:rPr>
+          <w:b/>
+          <w:bCs/>
+        </w:rPr>
+        <w:t>):*</w:t>
+      </w:r>
+      <w:proofErr w:type="gramEnd"/>
+      <w:r>
+        <w:rPr>
+          <w:b/>
+          <w:bCs/>
+        </w:rPr>
+        <w:t>* `Coqui TTS` (running `</w:t>
       </w:r>
       <w:proofErr w:type="spellStart"/>
       <w:r>
-        <w:t>speech_recognition</w:t>
+        <w:rPr>
+          <w:b/>
+          <w:bCs/>
+        </w:rPr>
+        <w:t>tts_models</w:t>
       </w:r>
       <w:proofErr w:type="spellEnd"/>
       <w:r>
-        <w:t xml:space="preserve"> library to capture microphone input and </w:t>
+        <w:rPr>
+          <w:b/>
+          <w:bCs/>
+        </w:rPr>
+        <w:t>/</w:t>
       </w:r>
       <w:proofErr w:type="spellStart"/>
       <w:r>
+        <w:rPr>
+          <w:b/>
+          <w:bCs/>
+        </w:rPr>
+        <w:t>en</w:t>
+      </w:r>
+      <w:proofErr w:type="spellEnd"/>
+      <w:r>
+        <w:rPr>
+          <w:b/>
+          <w:bCs/>
+        </w:rPr>
+        <w:t>/</w:t>
+      </w:r>
+      <w:proofErr w:type="spellStart"/>
+      <w:r>
+        <w:rPr>
+          <w:b/>
+          <w:bCs/>
+        </w:rPr>
+        <w:t>ljspeech</w:t>
+      </w:r>
+      <w:proofErr w:type="spellEnd"/>
+      <w:r>
+        <w:rPr>
+          <w:b/>
+          <w:bCs/>
+        </w:rPr>
+        <w:t>/vits`) for local, natural voice generation.</w:t>
+      </w:r>
+    </w:p>
+    <w:p>
+      <w:pPr>
+        <w:rPr>
+          <w:b/>
+          <w:bCs/>
+        </w:rPr>
+      </w:pPr>
+      <w:r>
+        <w:rPr>
+          <w:b/>
+          <w:bCs/>
+        </w:rPr>
+        <w:t xml:space="preserve">    *   **Audio </w:t>
+      </w:r>
+      <w:proofErr w:type="gramStart"/>
+      <w:r>
+        <w:rPr>
+          <w:b/>
+          <w:bCs/>
+        </w:rPr>
+        <w:t>Handling:*</w:t>
+      </w:r>
+      <w:proofErr w:type="gramEnd"/>
+      <w:r>
+        <w:rPr>
+          <w:b/>
+          <w:bCs/>
+        </w:rPr>
+        <w:t>*</w:t>
+      </w:r>
+    </w:p>
+    <w:p>
+      <w:pPr>
+        <w:rPr>
+          <w:b/>
+          <w:bCs/>
+        </w:rPr>
+      </w:pPr>
+      <w:r>
+        <w:rPr>
+          <w:b/>
+          <w:bCs/>
+        </w:rPr>
+        <w:t xml:space="preserve">        *   `</w:t>
+      </w:r>
+      <w:proofErr w:type="spellStart"/>
+      <w:r>
+        <w:rPr>
+          <w:b/>
+          <w:bCs/>
+        </w:rPr>
+        <w:t>sounddevice</w:t>
+      </w:r>
+      <w:proofErr w:type="spellEnd"/>
+      <w:r>
+        <w:rPr>
+          <w:b/>
+          <w:bCs/>
+        </w:rPr>
+        <w:t>` &amp; `</w:t>
+      </w:r>
+      <w:proofErr w:type="spellStart"/>
+      <w:r>
+        <w:rPr>
+          <w:b/>
+          <w:bCs/>
+        </w:rPr>
+        <w:t>numpy</w:t>
+      </w:r>
+      <w:proofErr w:type="spellEnd"/>
+      <w:r>
+        <w:rPr>
+          <w:b/>
+          <w:bCs/>
+        </w:rPr>
+        <w:t>`: For low-latency raw audio capture and processing.</w:t>
+      </w:r>
+    </w:p>
+    <w:p>
+      <w:pPr>
+        <w:rPr>
+          <w:b/>
+          <w:bCs/>
+        </w:rPr>
+      </w:pPr>
+      <w:r>
+        <w:rPr>
+          <w:b/>
+          <w:bCs/>
+        </w:rPr>
+        <w:t xml:space="preserve">        *   `</w:t>
+      </w:r>
+      <w:proofErr w:type="spellStart"/>
+      <w:r>
+        <w:rPr>
+          <w:b/>
+          <w:bCs/>
+        </w:rPr>
         <w:t>simpleaudio</w:t>
       </w:r>
       <w:proofErr w:type="spellEnd"/>
       <w:r>
-        <w:t xml:space="preserve"> to play the generated speech.</w:t>
-      </w:r>
-    </w:p>
-    <w:p>
-      <w:r>
-        <w:pict w14:anchorId="631C17A5">
-          <v:rect id="_x0000_i1058" style="width:0;height:1.5pt" o:hralign="center" o:hrstd="t" o:hr="t" fillcolor="#a0a0a0" stroked="f"/>
-        </w:pict>
-      </w:r>
-    </w:p>
-    <w:p>
-      <w:pPr>
-        <w:rPr>
-          <w:b/>
-          <w:bCs/>
-        </w:rPr>
-      </w:pPr>
+        <w:rPr>
+          <w:b/>
+          <w:bCs/>
+        </w:rPr>
+        <w:t>`: For audio playback.</w:t>
+      </w:r>
+    </w:p>
+    <w:p>
+      <w:pPr>
+        <w:rPr>
+          <w:b/>
+          <w:bCs/>
+        </w:rPr>
+      </w:pPr>
+      <w:r>
+        <w:rPr>
+          <w:b/>
+          <w:bCs/>
+        </w:rPr>
+        <w:t xml:space="preserve">        *   **Barge-In </w:t>
+      </w:r>
+      <w:proofErr w:type="gramStart"/>
+      <w:r>
+        <w:rPr>
+          <w:b/>
+          <w:bCs/>
+        </w:rPr>
+        <w:t>Logic:*</w:t>
+      </w:r>
+      <w:proofErr w:type="gramEnd"/>
+      <w:r>
+        <w:rPr>
+          <w:b/>
+          <w:bCs/>
+        </w:rPr>
+        <w:t>* Real-time RMS (energy) monitoring to detect interruptions during playback.</w:t>
+      </w:r>
+    </w:p>
+    <w:p>
+      <w:pPr>
+        <w:rPr>
+          <w:b/>
+          <w:bCs/>
+        </w:rPr>
+      </w:pPr>
+      <w:r>
+        <w:rPr>
+          <w:b/>
+          <w:bCs/>
+        </w:rPr>
+        <w:t xml:space="preserve">### </w:t>
+      </w:r>
       <w:r>
         <w:rPr>
           <w:rFonts w:ascii="Segoe UI Emoji" w:hAnsi="Segoe UI Emoji" w:cs="Segoe UI Emoji"/>
@@ -492,348 +1080,609 @@
     </w:p>
     <w:p>
       <w:pPr>
-        <w:numPr>
-          <w:ilvl w:val="0"/>
-          <w:numId w:val="4"/>
-        </w:numPr>
-      </w:pPr>
-      <w:r>
-        <w:rPr>
-          <w:b/>
-          <w:bCs/>
-        </w:rPr>
-        <w:t>What It Is (In Simple Terms):</w:t>
-      </w:r>
-      <w:r>
-        <w:t xml:space="preserve"> This is how 'telex' remembers things.</w:t>
-      </w:r>
-    </w:p>
-    <w:p>
-      <w:pPr>
-        <w:numPr>
-          <w:ilvl w:val="1"/>
-          <w:numId w:val="4"/>
-        </w:numPr>
-      </w:pPr>
-      <w:r>
-        <w:rPr>
-          <w:b/>
-          <w:bCs/>
-        </w:rPr>
-        <w:t>Short-Term Memory:</w:t>
-      </w:r>
-      <w:r>
-        <w:t xml:space="preserve"> Manages the current conversation flow, keeping track of what you're talking about right now.</w:t>
-      </w:r>
-    </w:p>
-    <w:p>
-      <w:pPr>
-        <w:numPr>
-          <w:ilvl w:val="1"/>
-          <w:numId w:val="4"/>
-        </w:numPr>
-      </w:pPr>
-      <w:r>
-        <w:rPr>
-          <w:b/>
-          <w:bCs/>
-        </w:rPr>
-        <w:t>Long-Term Memory:</w:t>
-      </w:r>
-      <w:r>
-        <w:t xml:space="preserve"> This is the cool part. Every conversation is stored in a special database (a vector database). It converts conversations into numbers (embeddings). When you ask 'telex' to "remember" something, it searches this database for the most similar past conversation to provide a context-aware answer. This is a technique called </w:t>
-      </w:r>
-      <w:r>
-        <w:rPr>
-          <w:b/>
-          <w:bCs/>
-        </w:rPr>
-        <w:t>Retrieval-Augmented Generation (RAG)</w:t>
-      </w:r>
-      <w:r>
-        <w:t>.</w:t>
-      </w:r>
-    </w:p>
-    <w:p>
-      <w:pPr>
-        <w:numPr>
-          <w:ilvl w:val="0"/>
-          <w:numId w:val="4"/>
-        </w:numPr>
-      </w:pPr>
-      <w:r>
-        <w:rPr>
-          <w:b/>
-          <w:bCs/>
-        </w:rPr>
-        <w:t>Tech Stack:</w:t>
-      </w:r>
-    </w:p>
-    <w:p>
-      <w:pPr>
-        <w:numPr>
-          <w:ilvl w:val="1"/>
-          <w:numId w:val="4"/>
-        </w:numPr>
-      </w:pPr>
-      <w:r>
-        <w:rPr>
-          <w:b/>
-          <w:bCs/>
-        </w:rPr>
-        <w:t>Long-Term Memory:</w:t>
-      </w:r>
-      <w:r>
-        <w:t xml:space="preserve"> </w:t>
+        <w:rPr>
+          <w:b/>
+          <w:bCs/>
+        </w:rPr>
+      </w:pPr>
+      <w:r>
+        <w:rPr>
+          <w:b/>
+          <w:bCs/>
+        </w:rPr>
+        <w:t xml:space="preserve">*   **What It </w:t>
+      </w:r>
+      <w:proofErr w:type="gramStart"/>
+      <w:r>
+        <w:rPr>
+          <w:b/>
+          <w:bCs/>
+        </w:rPr>
+        <w:t>Is:*</w:t>
+      </w:r>
+      <w:proofErr w:type="gramEnd"/>
+      <w:r>
+        <w:rPr>
+          <w:b/>
+          <w:bCs/>
+        </w:rPr>
+        <w:t>* The systems that allow 'telex' to retain context across sessions.</w:t>
+      </w:r>
+    </w:p>
+    <w:p>
+      <w:pPr>
+        <w:rPr>
+          <w:b/>
+          <w:bCs/>
+        </w:rPr>
+      </w:pPr>
+      <w:r>
+        <w:rPr>
+          <w:b/>
+          <w:bCs/>
+        </w:rPr>
+        <w:t xml:space="preserve">    *   **Short-Term </w:t>
+      </w:r>
+      <w:proofErr w:type="gramStart"/>
+      <w:r>
+        <w:rPr>
+          <w:b/>
+          <w:bCs/>
+        </w:rPr>
+        <w:t>Memory:*</w:t>
+      </w:r>
+      <w:proofErr w:type="gramEnd"/>
+      <w:r>
+        <w:rPr>
+          <w:b/>
+          <w:bCs/>
+        </w:rPr>
+        <w:t>* Tracks the immediate conversation thread.</w:t>
+      </w:r>
+    </w:p>
+    <w:p>
+      <w:pPr>
+        <w:rPr>
+          <w:b/>
+          <w:bCs/>
+        </w:rPr>
+      </w:pPr>
+      <w:r>
+        <w:rPr>
+          <w:b/>
+          <w:bCs/>
+        </w:rPr>
+        <w:t xml:space="preserve">    *   **Long-Term Memory (RAG</w:t>
+      </w:r>
+      <w:proofErr w:type="gramStart"/>
+      <w:r>
+        <w:rPr>
+          <w:b/>
+          <w:bCs/>
+        </w:rPr>
+        <w:t>):*</w:t>
+      </w:r>
+      <w:proofErr w:type="gramEnd"/>
+      <w:r>
+        <w:rPr>
+          <w:b/>
+          <w:bCs/>
+        </w:rPr>
+        <w:t>* Stores conversations as vector embeddings. When you ask to recall something, it queries this database for semantic matches before responding.</w:t>
+      </w:r>
+    </w:p>
+    <w:p>
+      <w:pPr>
+        <w:rPr>
+          <w:b/>
+          <w:bCs/>
+        </w:rPr>
+      </w:pPr>
+      <w:r>
+        <w:rPr>
+          <w:b/>
+          <w:bCs/>
+        </w:rPr>
+        <w:t xml:space="preserve">*   **Tech </w:t>
+      </w:r>
+      <w:proofErr w:type="gramStart"/>
+      <w:r>
+        <w:rPr>
+          <w:b/>
+          <w:bCs/>
+        </w:rPr>
+        <w:t>Stack:*</w:t>
+      </w:r>
+      <w:proofErr w:type="gramEnd"/>
+      <w:r>
+        <w:rPr>
+          <w:b/>
+          <w:bCs/>
+        </w:rPr>
+        <w:t>*</w:t>
+      </w:r>
+    </w:p>
+    <w:p>
+      <w:pPr>
+        <w:rPr>
+          <w:b/>
+          <w:bCs/>
+        </w:rPr>
+      </w:pPr>
+      <w:r>
+        <w:rPr>
+          <w:b/>
+          <w:bCs/>
+        </w:rPr>
+        <w:t xml:space="preserve">    *   **Vector </w:t>
+      </w:r>
+      <w:proofErr w:type="gramStart"/>
+      <w:r>
+        <w:rPr>
+          <w:b/>
+          <w:bCs/>
+        </w:rPr>
+        <w:t>Database:*</w:t>
+      </w:r>
+      <w:proofErr w:type="gramEnd"/>
+      <w:r>
+        <w:rPr>
+          <w:b/>
+          <w:bCs/>
+        </w:rPr>
+        <w:t>* `</w:t>
       </w:r>
       <w:proofErr w:type="spellStart"/>
       <w:r>
+        <w:rPr>
+          <w:b/>
+          <w:bCs/>
+        </w:rPr>
         <w:t>ChromaDB</w:t>
       </w:r>
       <w:proofErr w:type="spellEnd"/>
       <w:r>
-        <w:t xml:space="preserve"> (a vector database for efficient similarity search).</w:t>
-      </w:r>
-    </w:p>
-    <w:p>
-      <w:pPr>
-        <w:numPr>
-          <w:ilvl w:val="1"/>
-          <w:numId w:val="4"/>
-        </w:numPr>
-      </w:pPr>
-      <w:r>
-        <w:rPr>
-          <w:b/>
-          <w:bCs/>
-        </w:rPr>
-        <w:t>Data Conversion:</w:t>
-      </w:r>
-      <w:r>
-        <w:t xml:space="preserve"> sentence-transformers library to create numerical embeddings from text.</w:t>
-      </w:r>
-    </w:p>
-    <w:p>
-      <w:pPr>
-        <w:numPr>
-          <w:ilvl w:val="1"/>
-          <w:numId w:val="4"/>
-        </w:numPr>
-      </w:pPr>
-      <w:r>
-        <w:rPr>
-          <w:b/>
-          <w:bCs/>
-        </w:rPr>
-        <w:t>Conversation Logging:</w:t>
-      </w:r>
-      <w:r>
-        <w:t xml:space="preserve"> </w:t>
+        <w:rPr>
+          <w:b/>
+          <w:bCs/>
+        </w:rPr>
+        <w:t>` for storing and retrieving high-dimensional conversation data.</w:t>
+      </w:r>
+    </w:p>
+    <w:p>
+      <w:pPr>
+        <w:rPr>
+          <w:b/>
+          <w:bCs/>
+        </w:rPr>
+      </w:pPr>
+      <w:r>
+        <w:rPr>
+          <w:b/>
+          <w:bCs/>
+        </w:rPr>
+        <w:t xml:space="preserve">    *   **</w:t>
+      </w:r>
+      <w:proofErr w:type="gramStart"/>
+      <w:r>
+        <w:rPr>
+          <w:b/>
+          <w:bCs/>
+        </w:rPr>
+        <w:t>Embeddings:*</w:t>
+      </w:r>
+      <w:proofErr w:type="gramEnd"/>
+      <w:r>
+        <w:rPr>
+          <w:b/>
+          <w:bCs/>
+        </w:rPr>
+        <w:t>* `sentence-transformers` for converting text to numbers.</w:t>
+      </w:r>
+    </w:p>
+    <w:p>
+      <w:pPr>
+        <w:rPr>
+          <w:b/>
+          <w:bCs/>
+        </w:rPr>
+      </w:pPr>
+      <w:r>
+        <w:rPr>
+          <w:b/>
+          <w:bCs/>
+        </w:rPr>
+        <w:t xml:space="preserve">    *   **</w:t>
+      </w:r>
+      <w:proofErr w:type="gramStart"/>
+      <w:r>
+        <w:rPr>
+          <w:b/>
+          <w:bCs/>
+        </w:rPr>
+        <w:t>Logging:*</w:t>
+      </w:r>
+      <w:proofErr w:type="gramEnd"/>
+      <w:r>
+        <w:rPr>
+          <w:b/>
+          <w:bCs/>
+        </w:rPr>
+        <w:t>* `</w:t>
       </w:r>
       <w:proofErr w:type="spellStart"/>
       <w:r>
+        <w:rPr>
+          <w:b/>
+          <w:bCs/>
+        </w:rPr>
         <w:t>TinyDB</w:t>
       </w:r>
       <w:proofErr w:type="spellEnd"/>
       <w:r>
-        <w:t xml:space="preserve"> (a lightweight JSON database for simple logs).</w:t>
-      </w:r>
-    </w:p>
-    <w:p>
-      <w:r>
-        <w:pict w14:anchorId="47C3EE55">
-          <v:rect id="_x0000_i1059" style="width:0;height:1.5pt" o:hralign="center" o:hrstd="t" o:hr="t" fillcolor="#a0a0a0" stroked="f"/>
-        </w:pict>
-      </w:r>
-    </w:p>
-    <w:p>
-      <w:pPr>
-        <w:rPr>
-          <w:b/>
-          <w:bCs/>
-        </w:rPr>
-      </w:pPr>
-      <w:r>
-        <w:rPr>
-          <w:b/>
-          <w:bCs/>
-        </w:rPr>
-        <w:t>How It All Works Together</w:t>
-      </w:r>
-    </w:p>
-    <w:p>
-      <w:r>
-        <w:t>The entire process is a seamless loop:</w:t>
-      </w:r>
-    </w:p>
-    <w:p>
-      <w:pPr>
-        <w:numPr>
-          <w:ilvl w:val="0"/>
-          <w:numId w:val="5"/>
-        </w:numPr>
-      </w:pPr>
-      <w:r>
-        <w:rPr>
-          <w:b/>
-          <w:bCs/>
-        </w:rPr>
-        <w:t>You Speak or Type</w:t>
-      </w:r>
-      <w:r>
-        <w:t xml:space="preserve">: You interact with the </w:t>
-      </w:r>
-      <w:r>
-        <w:rPr>
-          <w:b/>
-          <w:bCs/>
-        </w:rPr>
-        <w:t>Face (UI)</w:t>
-      </w:r>
-      <w:r>
-        <w:t xml:space="preserve">. The </w:t>
-      </w:r>
-      <w:r>
-        <w:rPr>
-          <w:b/>
-          <w:bCs/>
-        </w:rPr>
-        <w:t>Ears (Voice System)</w:t>
-      </w:r>
-      <w:r>
-        <w:t xml:space="preserve"> might transcribe your speech into text.</w:t>
-      </w:r>
-    </w:p>
-    <w:p>
-      <w:pPr>
-        <w:numPr>
-          <w:ilvl w:val="0"/>
-          <w:numId w:val="5"/>
-        </w:numPr>
-      </w:pPr>
-      <w:r>
-        <w:rPr>
-          <w:b/>
-          <w:bCs/>
-        </w:rPr>
-        <w:t>The Brain Thinks</w:t>
-      </w:r>
-      <w:r>
-        <w:t xml:space="preserve">: The message goes to the </w:t>
-      </w:r>
-      <w:r>
-        <w:rPr>
-          <w:b/>
-          <w:bCs/>
-        </w:rPr>
-        <w:t>Brain (AI Core)</w:t>
-      </w:r>
-      <w:r>
-        <w:t>, which uses its personality and the conversation history to figure out what to say.</w:t>
-      </w:r>
-    </w:p>
-    <w:p>
-      <w:pPr>
-        <w:numPr>
-          <w:ilvl w:val="0"/>
-          <w:numId w:val="5"/>
-        </w:numPr>
-      </w:pPr>
-      <w:r>
-        <w:rPr>
-          <w:b/>
-          <w:bCs/>
-        </w:rPr>
-        <w:t>Memory Check</w:t>
-      </w:r>
-      <w:r>
-        <w:t xml:space="preserve">: If you ask it to remember something, it first consults its </w:t>
-      </w:r>
-      <w:r>
-        <w:rPr>
-          <w:b/>
-          <w:bCs/>
-        </w:rPr>
-        <w:t>Long-Term Memory</w:t>
-      </w:r>
-      <w:r>
-        <w:t xml:space="preserve"> to find relevant info before the </w:t>
-      </w:r>
-      <w:r>
-        <w:rPr>
-          <w:b/>
-          <w:bCs/>
-        </w:rPr>
-        <w:t>Brain</w:t>
-      </w:r>
-      <w:r>
-        <w:t xml:space="preserve"> forms an answer.</w:t>
-      </w:r>
-    </w:p>
-    <w:p>
-      <w:pPr>
-        <w:numPr>
-          <w:ilvl w:val="0"/>
-          <w:numId w:val="5"/>
-        </w:numPr>
-      </w:pPr>
-      <w:r>
-        <w:rPr>
-          <w:b/>
-          <w:bCs/>
-        </w:rPr>
-        <w:t>'telex' Responds</w:t>
-      </w:r>
-      <w:r>
-        <w:t xml:space="preserve">: The Brain's text response appears on the </w:t>
-      </w:r>
-      <w:r>
-        <w:rPr>
-          <w:b/>
-          <w:bCs/>
-        </w:rPr>
-        <w:t>Face (UI)</w:t>
-      </w:r>
-      <w:r>
-        <w:t xml:space="preserve"> and is spoken aloud by the </w:t>
-      </w:r>
-      <w:r>
-        <w:rPr>
-          <w:b/>
-          <w:bCs/>
-        </w:rPr>
-        <w:t>Mouth (Voice System)</w:t>
-      </w:r>
-      <w:r>
-        <w:t>.</w:t>
-      </w:r>
-    </w:p>
-    <w:p>
-      <w:pPr>
-        <w:numPr>
-          <w:ilvl w:val="0"/>
-          <w:numId w:val="5"/>
-        </w:numPr>
-      </w:pPr>
-      <w:r>
-        <w:rPr>
-          <w:b/>
-          <w:bCs/>
-        </w:rPr>
-        <w:t>Memory Saved</w:t>
-      </w:r>
-      <w:r>
-        <w:t xml:space="preserve">: The new exchange is saved into the </w:t>
-      </w:r>
-      <w:r>
-        <w:rPr>
-          <w:b/>
-          <w:bCs/>
-        </w:rPr>
-        <w:t>Long-Term Memory</w:t>
-      </w:r>
-      <w:r>
-        <w:t xml:space="preserve"> for future reference.</w:t>
+        <w:rPr>
+          <w:b/>
+          <w:bCs/>
+        </w:rPr>
+        <w:t>` and JSON based logs ([chat_</w:t>
+      </w:r>
+      <w:proofErr w:type="gramStart"/>
+      <w:r>
+        <w:rPr>
+          <w:b/>
+          <w:bCs/>
+        </w:rPr>
+        <w:t>history.json</w:t>
+      </w:r>
+      <w:proofErr w:type="gramEnd"/>
+      <w:r>
+        <w:rPr>
+          <w:b/>
+          <w:bCs/>
+        </w:rPr>
+        <w:t>](</w:t>
+      </w:r>
+      <w:r>
+        <w:rPr>
+          <w:b/>
+          <w:bCs/>
+          <w:u w:val="single"/>
+        </w:rPr>
+        <w:t>cci:7://file:///e:/Projects/@Personal_project/pc_assistant/AI-Assistant-/chat_history.json:0:0-0:0</w:t>
+      </w:r>
+      <w:r>
+        <w:rPr>
+          <w:b/>
+          <w:bCs/>
+        </w:rPr>
+        <w:t>)) for session persistence.</w:t>
+      </w:r>
+    </w:p>
+    <w:p>
+      <w:pPr>
+        <w:rPr>
+          <w:b/>
+          <w:bCs/>
+        </w:rPr>
+      </w:pPr>
+      <w:r>
+        <w:rPr>
+          <w:b/>
+          <w:bCs/>
+        </w:rPr>
+        <w:t>## How It All Works Together</w:t>
+      </w:r>
+    </w:p>
+    <w:p>
+      <w:pPr>
+        <w:rPr>
+          <w:b/>
+          <w:bCs/>
+        </w:rPr>
+      </w:pPr>
+      <w:r>
+        <w:rPr>
+          <w:b/>
+          <w:bCs/>
+        </w:rPr>
+        <w:t xml:space="preserve">1.  **You </w:t>
+      </w:r>
+      <w:proofErr w:type="gramStart"/>
+      <w:r>
+        <w:rPr>
+          <w:b/>
+          <w:bCs/>
+        </w:rPr>
+        <w:t>Speak:*</w:t>
+      </w:r>
+      <w:proofErr w:type="gramEnd"/>
+      <w:r>
+        <w:rPr>
+          <w:b/>
+          <w:bCs/>
+        </w:rPr>
+        <w:t>* You interact via the new Eclipse UI. The "Ears" (Voice Handler) constantly monitor for speech, visualized by the purple breathing ring.</w:t>
+      </w:r>
+    </w:p>
+    <w:p>
+      <w:pPr>
+        <w:rPr>
+          <w:b/>
+          <w:bCs/>
+        </w:rPr>
+      </w:pPr>
+      <w:r>
+        <w:rPr>
+          <w:b/>
+          <w:bCs/>
+        </w:rPr>
+        <w:t xml:space="preserve">2.  **Transcribe &amp; </w:t>
+      </w:r>
+      <w:proofErr w:type="gramStart"/>
+      <w:r>
+        <w:rPr>
+          <w:b/>
+          <w:bCs/>
+        </w:rPr>
+        <w:t>Check:*</w:t>
+      </w:r>
+      <w:proofErr w:type="gramEnd"/>
+      <w:r>
+        <w:rPr>
+          <w:b/>
+          <w:bCs/>
+        </w:rPr>
+        <w:t>* When you speak, the system transcribes it locally. If you interrupted the AI, the "Barge-in" system immediately cuts off the "Mouth" to prioritize your new input.</w:t>
+      </w:r>
+    </w:p>
+    <w:p>
+      <w:pPr>
+        <w:rPr>
+          <w:b/>
+          <w:bCs/>
+        </w:rPr>
+      </w:pPr>
+      <w:r>
+        <w:rPr>
+          <w:b/>
+          <w:bCs/>
+        </w:rPr>
+        <w:t xml:space="preserve">3.  **Memory </w:t>
+      </w:r>
+      <w:proofErr w:type="gramStart"/>
+      <w:r>
+        <w:rPr>
+          <w:b/>
+          <w:bCs/>
+        </w:rPr>
+        <w:t>Retrieval:*</w:t>
+      </w:r>
+      <w:proofErr w:type="gramEnd"/>
+      <w:r>
+        <w:rPr>
+          <w:b/>
+          <w:bCs/>
+        </w:rPr>
+        <w:t>* The logic layer checks `</w:t>
+      </w:r>
+      <w:proofErr w:type="spellStart"/>
+      <w:r>
+        <w:rPr>
+          <w:b/>
+          <w:bCs/>
+        </w:rPr>
+        <w:t>ChromaDB</w:t>
+      </w:r>
+      <w:proofErr w:type="spellEnd"/>
+      <w:r>
+        <w:rPr>
+          <w:b/>
+          <w:bCs/>
+        </w:rPr>
+        <w:t xml:space="preserve">` for any relevant </w:t>
+      </w:r>
+      <w:proofErr w:type="gramStart"/>
+      <w:r>
+        <w:rPr>
+          <w:b/>
+          <w:bCs/>
+        </w:rPr>
+        <w:t>past memories</w:t>
+      </w:r>
+      <w:proofErr w:type="gramEnd"/>
+      <w:r>
+        <w:rPr>
+          <w:b/>
+          <w:bCs/>
+        </w:rPr>
+        <w:t xml:space="preserve"> associated with your query.</w:t>
+      </w:r>
+    </w:p>
+    <w:p>
+      <w:pPr>
+        <w:rPr>
+          <w:b/>
+          <w:bCs/>
+        </w:rPr>
+      </w:pPr>
+      <w:r>
+        <w:rPr>
+          <w:b/>
+          <w:bCs/>
+        </w:rPr>
+        <w:t xml:space="preserve">4.  **The Brain </w:t>
+      </w:r>
+      <w:proofErr w:type="gramStart"/>
+      <w:r>
+        <w:rPr>
+          <w:b/>
+          <w:bCs/>
+        </w:rPr>
+        <w:t>Thinks:*</w:t>
+      </w:r>
+      <w:proofErr w:type="gramEnd"/>
+      <w:r>
+        <w:rPr>
+          <w:b/>
+          <w:bCs/>
+        </w:rPr>
+        <w:t>* The LLM receives your text + relevant memories + personality instructions. The UI spins blue to indicate processing.</w:t>
+      </w:r>
+    </w:p>
+    <w:p>
+      <w:pPr>
+        <w:rPr>
+          <w:b/>
+          <w:bCs/>
+        </w:rPr>
+      </w:pPr>
+      <w:r>
+        <w:rPr>
+          <w:b/>
+          <w:bCs/>
+        </w:rPr>
+        <w:t>5.  **</w:t>
+      </w:r>
+      <w:proofErr w:type="gramStart"/>
+      <w:r>
+        <w:rPr>
+          <w:b/>
+          <w:bCs/>
+        </w:rPr>
+        <w:t>Response:*</w:t>
+      </w:r>
+      <w:proofErr w:type="gramEnd"/>
+      <w:r>
+        <w:rPr>
+          <w:b/>
+          <w:bCs/>
+        </w:rPr>
+        <w:t>* The AI generates a text response.</w:t>
+      </w:r>
+    </w:p>
+    <w:p>
+      <w:pPr>
+        <w:rPr>
+          <w:b/>
+          <w:bCs/>
+        </w:rPr>
+      </w:pPr>
+      <w:r>
+        <w:rPr>
+          <w:b/>
+          <w:bCs/>
+        </w:rPr>
+        <w:t>6.  **</w:t>
+      </w:r>
+      <w:proofErr w:type="gramStart"/>
+      <w:r>
+        <w:rPr>
+          <w:b/>
+          <w:bCs/>
+        </w:rPr>
+        <w:t>Output:*</w:t>
+      </w:r>
+      <w:proofErr w:type="gramEnd"/>
+      <w:r>
+        <w:rPr>
+          <w:b/>
+          <w:bCs/>
+        </w:rPr>
+        <w:t>*</w:t>
+      </w:r>
+    </w:p>
+    <w:p>
+      <w:pPr>
+        <w:rPr>
+          <w:b/>
+          <w:bCs/>
+        </w:rPr>
+      </w:pPr>
+      <w:r>
+        <w:rPr>
+          <w:b/>
+          <w:bCs/>
+        </w:rPr>
+        <w:t xml:space="preserve">    *   **The </w:t>
+      </w:r>
+      <w:proofErr w:type="gramStart"/>
+      <w:r>
+        <w:rPr>
+          <w:b/>
+          <w:bCs/>
+        </w:rPr>
+        <w:t>Face:*</w:t>
+      </w:r>
+      <w:proofErr w:type="gramEnd"/>
+      <w:r>
+        <w:rPr>
+          <w:b/>
+          <w:bCs/>
+        </w:rPr>
+        <w:t>* Displays the text and shifts the Eclipse animation to an energetic pink pulse.</w:t>
+      </w:r>
+    </w:p>
+    <w:p>
+      <w:pPr>
+        <w:rPr>
+          <w:b/>
+          <w:bCs/>
+        </w:rPr>
+      </w:pPr>
+      <w:r>
+        <w:rPr>
+          <w:b/>
+          <w:bCs/>
+        </w:rPr>
+        <w:t xml:space="preserve">    *   **The </w:t>
+      </w:r>
+      <w:proofErr w:type="gramStart"/>
+      <w:r>
+        <w:rPr>
+          <w:b/>
+          <w:bCs/>
+        </w:rPr>
+        <w:t>Mouth:*</w:t>
+      </w:r>
+      <w:proofErr w:type="gramEnd"/>
+      <w:r>
+        <w:rPr>
+          <w:b/>
+          <w:bCs/>
+        </w:rPr>
+        <w:t>* Generates and plays the audio response locally.</w:t>
+      </w:r>
+    </w:p>
+    <w:p>
+      <w:pPr>
+        <w:rPr>
+          <w:b/>
+          <w:bCs/>
+        </w:rPr>
+      </w:pPr>
+      <w:r>
+        <w:rPr>
+          <w:b/>
+          <w:bCs/>
+        </w:rPr>
+        <w:lastRenderedPageBreak/>
+        <w:t>7.  **</w:t>
+      </w:r>
+      <w:proofErr w:type="gramStart"/>
+      <w:r>
+        <w:rPr>
+          <w:b/>
+          <w:bCs/>
+        </w:rPr>
+        <w:t>Archival:*</w:t>
+      </w:r>
+      <w:proofErr w:type="gramEnd"/>
+      <w:r>
+        <w:rPr>
+          <w:b/>
+          <w:bCs/>
+        </w:rPr>
+        <w:t>* The interaction is embedded and saved to Long-Term Memory for future recall.</w:t>
       </w:r>
     </w:p>
     <w:p/>

</xml_diff>